<commit_message>
Add technical project management to resume
</commit_message>
<xml_diff>
--- a/Naveen Kumar_Business Intelligence Manager-10 years.docx
+++ b/Naveen Kumar_Business Intelligence Manager-10 years.docx
@@ -404,7 +404,7 @@
               <w:rPr>
                 <w:sz w:val="18"/>
               </w:rPr>
-              <w:t>BI and data analytics leader who turns operational, marketing, finance, and process data into governed analytics, reliable pipelines, executive-ready insights, and stakeholder decisions.</w:t>
+              <w:t>BI and data analytics leader who turns operational, marketing, finance, and process data into governed analytics, reliable pipelines, executive-ready insights, stakeholder decisions, and well-managed technical delivery.</w:t>
             </w:r>
           </w:p>
           <w:p>
@@ -494,7 +494,7 @@
               <w:rPr>
                 <w:sz w:val="18"/>
               </w:rPr>
-              <w:t>Power BI, Tableau, Looker, BigQuery, PostgreSQL, SQL, Python, Fabric, Databricks, Delta Lake, Airflow-style pipelines, Advanced Excel, Celonis</w:t>
+              <w:t>Power BI, Tableau, Looker, BigQuery, PostgreSQL, SQL, Python, Fabric, Databricks, Delta Lake, Airflow-style pipelines, Jira, Advanced Excel, Celonis</w:t>
             </w:r>
           </w:p>
           <w:p>
@@ -538,7 +538,7 @@
               <w:rPr>
                 <w:sz w:val="18"/>
               </w:rPr>
-              <w:t>Requirement gathering, stakeholder management, client communication, KPI governance, SLA analysis, quality analytics, team leadership, executive presentation.</w:t>
+              <w:t>Requirement gathering, technical project management, Jira tracking, stakeholder management, client communication, KPI governance, SLA analysis, quality analytics, team leadership, executive presentation.</w:t>
             </w:r>
           </w:p>
         </w:tc>
@@ -638,7 +638,7 @@
                 <w:color w:val="5C6870"/>
                 <w:sz w:val="16"/>
               </w:rPr>
-              <w:t>P&amp;L, campaign, SLA, quality, and operational performance views for leadership decisions.</w:t>
+              <w:t>P&amp;L, campaign, SLA, quality, and operational performance views for leadership decisions, with delivery planning and milestone tracking.</w:t>
             </w:r>
           </w:p>
         </w:tc>
@@ -685,7 +685,7 @@
                 <w:color w:val="5C6870"/>
                 <w:sz w:val="16"/>
               </w:rPr>
-              <w:t>Fabric, Databricks, BigQuery, PostgreSQL, SQL-ready datasets, refresh design, and automation.</w:t>
+              <w:t>Fabric, Databricks, BigQuery, PostgreSQL, SQL-ready datasets, refresh design, automation, and Jira-backed delivery coordination.</w:t>
             </w:r>
           </w:p>
         </w:tc>
@@ -732,7 +732,7 @@
                 <w:color w:val="5C6870"/>
                 <w:sz w:val="16"/>
               </w:rPr>
-              <w:t>Requirement gathering, dashboard logic validation, executive narratives, and client-ready reporting.</w:t>
+              <w:t>Requirement gathering, Jira/backlog tracking, UAT coordination, dashboard logic validation, executive narratives, and client-ready reporting.</w:t>
             </w:r>
           </w:p>
         </w:tc>
@@ -878,7 +878,7 @@
                 <w:color w:val="5C6870"/>
                 <w:sz w:val="16"/>
               </w:rPr>
-              <w:t>RLS, scheduled refreshes, subscriptions, KPI definitions, quality checks, and scalable templates.</w:t>
+              <w:t>RLS, scheduled refreshes, subscriptions, KPI definitions, quality checks, scalable templates, and controlled release management.</w:t>
             </w:r>
           </w:p>
         </w:tc>
@@ -923,7 +923,7 @@
         <w:rPr>
           <w:sz w:val="17"/>
         </w:rPr>
-        <w:t>Currently leads BI delivery for digital marketing analytics, pipelines, dashboards, SLA tracking, and KPI analysis at Silverpush.</w:t>
+        <w:t>Currently leads BI delivery for digital marketing analytics, pipelines, dashboards, SLA tracking, KPI analysis, and technical project coordination at Silverpush.</w:t>
       </w:r>
     </w:p>
     <w:p>
@@ -962,7 +962,7 @@
         <w:rPr>
           <w:sz w:val="17"/>
         </w:rPr>
-        <w:t>Combines hands-on BI development with business analysis, client management, automation, and executive communication.</w:t>
+        <w:t>Combines hands-on BI development with business analysis, technical project management, client management, automation, and executive communication.</w:t>
       </w:r>
     </w:p>
     <w:p>
@@ -1125,7 +1125,7 @@
         <w:rPr>
           <w:sz w:val="18"/>
         </w:rPr>
-        <w:t>10+ years of professional experience including knowledge of various platforms such as Tableau, Power BI, Python, Celonis, Advanced Excel, BigQuery, PostgreSQL, Looker, SQL, data pipelines, and Airflow-style orchestration, along with client and stakeholder management.</w:t>
+        <w:t>10+ years of professional experience including Tableau, Power BI, Python, Celonis, Advanced Excel, BigQuery, PostgreSQL, Looker, SQL, data pipelines, Airflow-style orchestration, Jira, Agile delivery, technical project management, and client/stakeholder management.</w:t>
       </w:r>
     </w:p>
     <w:p>
@@ -1138,7 +1138,7 @@
         <w:rPr>
           <w:sz w:val="18"/>
         </w:rPr>
-        <w:t>Worked with internal and external clients globally to provide high-quality data insights, including business analysis, requirement gathering, automation requirements, data analysis using Tableau, Power BI, Databricks, Fabric, BigQuery, PostgreSQL, MS Excel and Python, project testing, client coordination, report quality maintenance, accurate calculations, and executive presentations using PowerPoint and Canva.</w:t>
+        <w:t>Worked with internal and external clients globally to provide high-quality data insights, including business analysis, requirement gathering, automation requirements, technical project planning, Jira/backlog tracking, data analysis using Tableau, Power BI, Databricks, Fabric, BigQuery, PostgreSQL, MS Excel and Python, project testing, UAT coordination, report quality maintenance, accurate calculations, and executive presentations using PowerPoint and Canva.</w:t>
       </w:r>
     </w:p>
     <w:p>
@@ -1175,7 +1175,7 @@
         <w:spacing w:after="60" w:line="240" w:lineRule="auto"/>
       </w:pPr>
       <w:r>
-        <w:t>Power BI, Fabric, Power Query, DAX, Power Pivot, Tableau, Looker, BigQuery, PostgreSQL, Databricks, Delta Lake, Data Pipelines, Airflow, Data Analysis, Data Visualization, Data Warehousing, Executive Presentation/Communication, Advanced Excel, SQL, Python, Celonis, Process Mining, Stakeholder Management</w:t>
+        <w:t>Power BI, Fabric, Power Query, DAX, Power Pivot, Tableau, Looker, BigQuery, PostgreSQL, Databricks, Delta Lake, Data Pipelines, Airflow, Data Analysis, Data Visualization, Data Warehousing, Technical Project Management, Jira, Agile Delivery, Sprint Planning, UAT Coordination, Executive Presentation/Communication, Advanced Excel, SQL, Python, Celonis, Process Mining, Stakeholder Management</w:t>
       </w:r>
     </w:p>
     <w:p>
@@ -1237,7 +1237,7 @@
         <w:rPr>
           <w:sz w:val="18"/>
         </w:rPr>
-        <w:t>Leading a Business Intelligence team in a digital marketing process and creating data pipelines, dashboards, and data analysis.</w:t>
+        <w:t>Leading a Business Intelligence team in a digital marketing process, managing technical delivery, and creating data pipelines, dashboards, and data analysis.</w:t>
       </w:r>
     </w:p>
     <w:p>
@@ -1250,7 +1250,7 @@
         <w:rPr>
           <w:sz w:val="18"/>
         </w:rPr>
-        <w:t>Maintenance and creation of Power BI, Power Query, DAX, Looker, and Tableau dashboards as per requirement.</w:t>
+        <w:t>Maintenance and creation of Power BI, Power Query, DAX, Looker, and Tableau dashboards as per requirement, with Jira-based task tracking and release follow-up.</w:t>
       </w:r>
     </w:p>
     <w:p>
@@ -1353,7 +1353,7 @@
         <w:rPr>
           <w:sz w:val="18"/>
         </w:rPr>
-        <w:t>Led a Process Excellence team in a Contract Lifecycle Management process for data management.</w:t>
+        <w:t>Led a Process Excellence team in a Contract Lifecycle Management process for data management, technical project coordination, and analytics delivery.</w:t>
       </w:r>
     </w:p>
     <w:p>
@@ -1444,7 +1444,7 @@
         <w:rPr>
           <w:sz w:val="18"/>
         </w:rPr>
-        <w:t>Managed client and stakeholder relationships to ensure needs were met and expectations exceeded.</w:t>
+        <w:t>Managed client and stakeholder relationships, delivery expectations, UAT feedback, and project priorities to ensure needs were met and expectations exceeded.</w:t>
       </w:r>
     </w:p>
     <w:p>
@@ -1659,7 +1659,7 @@
         <w:rPr>
           <w:sz w:val="18"/>
         </w:rPr>
-        <w:t>Handled knowledge sharing, stakeholder management, one-on-one feedback sessions, rosters, leaves, shrinkage, and attrition tracking.</w:t>
+        <w:t>Handled knowledge sharing, stakeholder management, project coordination, one-on-one feedback sessions, rosters, leaves, shrinkage, and attrition tracking.</w:t>
       </w:r>
     </w:p>
     <w:p>
@@ -1858,7 +1858,7 @@
           <w:b/>
           <w:sz w:val="20"/>
         </w:rPr>
-        <w:t>Management P&amp;L Analytics | Power BI, BigQuery, PostgreSQL, SQL</w:t>
+        <w:t>Management P&amp;L Analytics | Power BI, BigQuery, PostgreSQL, SQL, Jira</w:t>
       </w:r>
     </w:p>
     <w:p>
@@ -1923,7 +1923,7 @@
         <w:rPr>
           <w:sz w:val="18"/>
         </w:rPr>
-        <w:t>Collaborated with finance and operations teams to validate data accuracy and align dashboard logic with financial reporting standards.</w:t>
+        <w:t>Collaborated with finance and operations teams to validate data accuracy, manage delivery checkpoints, coordinate UAT, and align dashboard logic with financial reporting standards.</w:t>
       </w:r>
     </w:p>
     <w:p>
@@ -1944,7 +1944,7 @@
           <w:b/>
           <w:sz w:val="20"/>
         </w:rPr>
-        <w:t>Client Campaign Analytics | Power BI Embedded, Looker, BigQuery</w:t>
+        <w:t>Client Campaign Analytics | Power BI Embedded, Looker, BigQuery, Agile Delivery</w:t>
       </w:r>
     </w:p>
     <w:p>
@@ -1996,7 +1996,7 @@
         <w:rPr>
           <w:sz w:val="18"/>
         </w:rPr>
-        <w:t>Enabled scheduled data refreshes and subscription-based delivery of analytics pages for client stakeholders.</w:t>
+        <w:t>Enabled scheduled data refreshes, subscription-based delivery, stakeholder demos, feedback tracking, and release handover for client analytics pages.</w:t>
       </w:r>
     </w:p>
     <w:p>
@@ -2077,7 +2077,7 @@
           <w:b/>
           <w:sz w:val="20"/>
         </w:rPr>
-        <w:t>SLA Operations Analytics | Tableau, SQL, Airflow-style Pipelines</w:t>
+        <w:t>SLA Operations Analytics | Tableau, SQL, Airflow-style Pipelines, Jira</w:t>
       </w:r>
     </w:p>
     <w:p>
@@ -2116,7 +2116,7 @@
         <w:rPr>
           <w:sz w:val="18"/>
         </w:rPr>
-        <w:t>Designed for scalability as SLA requirements changed, including refresh patterns suited to pipeline scheduling.</w:t>
+        <w:t>Designed for scalability as SLA requirements changed, including refresh patterns suited to pipeline scheduling, delivery tracking, and controlled rollout.</w:t>
       </w:r>
     </w:p>
     <w:p>
@@ -2197,7 +2197,7 @@
           <w:b/>
           <w:sz w:val="20"/>
         </w:rPr>
-        <w:t>Performance Forecasting | Python, Power BI, Data Pipelines</w:t>
+        <w:t>Performance Forecasting | Python, Power BI, Data Pipelines, Technical PM</w:t>
       </w:r>
     </w:p>
     <w:p>
@@ -2237,7 +2237,7 @@
         <w:rPr>
           <w:sz w:val="18"/>
         </w:rPr>
-        <w:t>Visualized Python-generated forecasts in Power BI for stakeholder and client communication.</w:t>
+        <w:t>Visualized Python-generated forecasts in Power BI for stakeholder communication, project review discussions, and client decision-making.</w:t>
       </w:r>
     </w:p>
     <w:p>
@@ -2357,7 +2357,7 @@
         <w:rPr>
           <w:sz w:val="18"/>
         </w:rPr>
-        <w:t>Translated complex data into actionable insights for informed decision-making and improved transparency.</w:t>
+        <w:t>Translated complex data into actionable insights for informed decision-making, project governance, and improved transparency.</w:t>
       </w:r>
     </w:p>
     <w:p>

</xml_diff>